<commit_message>
Rename 'Bank transfer' payment method to 'ACH'
For bodega owners, 'ACH' is the correct term — and it excludes wire, which
carries $25-50 sender fees that erode margin on smaller PO orders. Venmo
and Zelle stay for convenience on smaller/faster payments.

- DB: pay_method CHECK now permits Venmo/Zelle/ACH only (verified).
- index.html: Mark as paid dropdown options updated.
- schema.sql: CHECK constraint matches production.
- SOP.docx: reflects the three payment options and explicitly tells reps
  not to accept wire transfers.

Co-Authored-By: Claude Opus 4.6 (1M context) <noreply@anthropic.com>
</commit_message>
<xml_diff>
--- a/SOP.docx
+++ b/SOP.docx
@@ -1719,7 +1719,30 @@
         <w:spacing w:after="80" w:before="60" w:line="300"/>
       </w:pPr>
       <w:r>
-        <w:t xml:space="preserve">Go to the Invoices tab, find the order, tap "Mark as paid," select the method (Venmo, Zelle, or Bank transfer), and enter the date. You can also do this from the Orders tab inside the account.</w:t>
+        <w:t xml:space="preserve">Go to the Invoices tab, find the order, tap "Mark as paid," select the method (Venmo, Zelle, or ACH), and enter the date. You can also do this from the Orders tab inside the account.</w:t>
+      </w:r>
+    </w:p>
+    <w:p>
+      <w:pPr>
+        <w:spacing w:after="40" w:before="40"/>
+      </w:pPr>
+      <w:r>
+        <w:t xml:space="preserve"/>
+      </w:r>
+    </w:p>
+    <w:p>
+      <w:pPr>
+        <w:spacing w:after="80" w:before="60" w:line="300"/>
+      </w:pPr>
+      <w:r>
+        <w:rPr>
+          <w:b/>
+          <w:bCs/>
+        </w:rPr>
+        <w:t xml:space="preserve">Letting the store choose: </w:t>
+      </w:r>
+      <w:r>
+        <w:t xml:space="preserve">When closing a PO, ask which method is easiest for them — Venmo, Zelle, or ACH. Most bodega owners prefer Zelle (it’s built into their bank app). Do not accept wire transfers: sender fees are $25–$50 which eats into the account’s margin on small orders.</w:t>
       </w:r>
     </w:p>
     <w:p>

</xml_diff>

<commit_message>
Replace em dashes with hyphens in SOP
Straight ASCII hyphens throughout the SOP text. The en dash in the
day-guard brand name is preserved since it's part of the logo styling.

Co-Authored-By: Claude Opus 4.6 (1M context) <noreply@anthropic.com>
</commit_message>
<xml_diff>
--- a/SOP.docx
+++ b/SOP.docx
@@ -111,7 +111,7 @@
         <w:spacing w:after="80" w:before="60" w:line="300"/>
       </w:pPr>
       <w:r>
-        <w:t xml:space="preserve">This CRM tracks every retail account day-guard has a direct relationship with across NYC, Boston, Providence, and New Jersey. Direct accounts only — stores that came through a distributor do not belong here.</w:t>
+        <w:t xml:space="preserve">This CRM tracks every retail account day-guard has a direct relationship with across NYC, Boston, Providence, and New Jersey. Direct accounts only - stores that came through a distributor do not belong here.</w:t>
       </w:r>
     </w:p>
     <w:p>
@@ -190,7 +190,7 @@
         <w:spacing w:after="80" w:before="60" w:line="300"/>
       </w:pPr>
       <w:r>
-        <w:t xml:space="preserve">The password is shared across the team and stays signed in on your device for 30 days — you won't need to log in again every session. Everything you save syncs in real time to the whole team.</w:t>
+        <w:t xml:space="preserve">The password is shared across the team and stays signed in on your device for 30 days - you won't need to log in again every session. Everything you save syncs in real time to the whole team.</w:t>
       </w:r>
     </w:p>
     <w:p>
@@ -933,7 +933,7 @@
         <w:spacing w:after="80" w:before="240"/>
       </w:pPr>
       <w:r>
-        <w:t xml:space="preserve">Before the visit — fill in upfront</w:t>
+        <w:t xml:space="preserve">Before the visit - fill in upfront</w:t>
       </w:r>
     </w:p>
     <w:p>
@@ -1007,20 +1007,20 @@
         <w:spacing w:after="80" w:before="240"/>
       </w:pPr>
       <w:r>
-        <w:t xml:space="preserve">After the visit — fill in when you get back</w:t>
-      </w:r>
-    </w:p>
-    <w:p>
-      <w:pPr>
-        <w:pStyle w:val="ListParagraph"/>
-        <w:numPr>
-          <w:ilvl w:val="0"/>
-          <w:numId w:val="3"/>
-        </w:numPr>
-        <w:spacing w:after="30" w:before="30" w:line="300"/>
-      </w:pPr>
-      <w:r>
-        <w:t xml:space="preserve">Contact name and phone number (the decision maker — most important field)</w:t>
+        <w:t xml:space="preserve">After the visit - fill in when you get back</w:t>
+      </w:r>
+    </w:p>
+    <w:p>
+      <w:pPr>
+        <w:pStyle w:val="ListParagraph"/>
+        <w:numPr>
+          <w:ilvl w:val="0"/>
+          <w:numId w:val="3"/>
+        </w:numPr>
+        <w:spacing w:after="30" w:before="30" w:line="300"/>
+      </w:pPr>
+      <w:r>
+        <w:t xml:space="preserve">Contact name and phone number (the decision maker - most important field)</w:t>
       </w:r>
     </w:p>
     <w:p>
@@ -1209,7 +1209,7 @@
         <w:spacing w:after="20" w:before="20" w:line="300"/>
       </w:pPr>
       <w:r>
-        <w:t xml:space="preserve">MSRP $3.99 per stick. Wholesale $2 per stick ($20 per box of 10 sticks) — 50% margin on every stick sold.</w:t>
+        <w:t xml:space="preserve">MSRP $3.99 per stick. Wholesale $2 per stick ($20 per box of 10 sticks) - 50% margin on every stick sold.</w:t>
       </w:r>
     </w:p>
     <w:p>
@@ -1268,7 +1268,7 @@
         <w:t xml:space="preserve">Offer the trial.</w:t>
       </w:r>
       <w:r>
-        <w:t xml:space="preserve"> Tell them: "Pay for one box, we give you a second one free. Low risk — see how your customers respond before placing a full wholesale order."</w:t>
+        <w:t xml:space="preserve"> Tell them: "Pay for one box, we give you a second one free. Low risk - see how your customers respond before placing a full wholesale order."</w:t>
       </w:r>
     </w:p>
     <w:p>
@@ -1643,7 +1643,7 @@
         <w:spacing w:after="30" w:before="30" w:line="300"/>
       </w:pPr>
       <w:r>
-        <w:t xml:space="preserve">Log check-in every week — boxes remaining is your sell-through velocity data.</w:t>
+        <w:t xml:space="preserve">Log check-in every week - boxes remaining is your sell-through velocity data.</w:t>
       </w:r>
     </w:p>
     <w:p>
@@ -1677,7 +1677,7 @@
         <w:spacing w:after="80" w:before="240"/>
       </w:pPr>
       <w:r>
-        <w:t xml:space="preserve">Trial payment — collected in person</w:t>
+        <w:t xml:space="preserve">Trial payment - collected in person</w:t>
       </w:r>
     </w:p>
     <w:p>
@@ -1694,7 +1694,7 @@
         <w:spacing w:after="80" w:before="240"/>
       </w:pPr>
       <w:r>
-        <w:t xml:space="preserve">PO invoices — NET30</w:t>
+        <w:t xml:space="preserve">PO invoices - NET30</w:t>
       </w:r>
     </w:p>
     <w:p>
@@ -1702,7 +1702,7 @@
         <w:spacing w:after="80" w:before="60" w:line="300"/>
       </w:pPr>
       <w:r>
-        <w:t xml:space="preserve">All PO orders are on NET30 terms. After a store confirms an order: log the PO in the CRM, then send the invoice by email or text. Once sent, tap "Mark invoice sent" in the CRM — the 30-day clock starts from that date.</w:t>
+        <w:t xml:space="preserve">All PO orders are on NET30 terms. After a store confirms an order: log the PO in the CRM, then send the invoice by email or text. Once sent, tap "Mark invoice sent" in the CRM - the 30-day clock starts from that date.</w:t>
       </w:r>
     </w:p>
     <w:p>
@@ -1742,7 +1742,7 @@
         <w:t xml:space="preserve">Letting the store choose: </w:t>
       </w:r>
       <w:r>
-        <w:t xml:space="preserve">When closing a PO, ask which method is easiest for them — Venmo, Zelle, or ACH. Most bodega owners prefer Zelle (it’s built into their bank app). Do not accept wire transfers: sender fees are $25–$50 which eats into the account’s margin on small orders.</w:t>
+        <w:t xml:space="preserve">When closing a PO, ask which method is easiest for them - Venmo, Zelle, or ACH. Most bodega owners prefer Zelle (it’s built into their bank app). Do not accept wire transfers: sender fees are $25-$50 which eats into the account’s margin on small orders.</w:t>
       </w:r>
     </w:p>
     <w:p>
@@ -2322,7 +2322,7 @@
         <w:spacing w:after="80" w:before="240"/>
       </w:pPr>
       <w:r>
-        <w:t xml:space="preserve">Step 2  |  First visit — always in person</w:t>
+        <w:t xml:space="preserve">Step 2  |  First visit - always in person</w:t>
       </w:r>
     </w:p>
     <w:p>
@@ -2454,7 +2454,7 @@
         <w:spacing w:after="80" w:before="240"/>
       </w:pPr>
       <w:r>
-        <w:t xml:space="preserve">Step 3  |  Trial — weekly calls</w:t>
+        <w:t xml:space="preserve">Step 3  |  Trial - weekly calls</w:t>
       </w:r>
     </w:p>
     <w:p>
@@ -2554,7 +2554,7 @@
         <w:spacing w:after="80" w:before="240"/>
       </w:pPr>
       <w:r>
-        <w:t xml:space="preserve">Step 4  |  Active — weekly calls</w:t>
+        <w:t xml:space="preserve">Step 4  |  Active - weekly calls</w:t>
       </w:r>
     </w:p>
     <w:p>

</xml_diff>